<commit_message>
website.announcement: HTML render transform and #quarto-header gating (bd-website-announcement-w1gtpzki)
AnnouncementRenderTransform renders navigation.announcement into
rendered.navigation.announcement-{above,below}; the header partial places
them around the navbar/secondary nav (Q1 order), and an announcement alone
opens #quarto-header. HEADER_CONTENT_KEYS / page_has_header single-source
the header predicate for quarto-nav-js.

The new announcement-close language term changes every Pandoc request, so
the parity-book input golden and the pandoc recordings are re-recorded
(capture-pandoc-recordings, pandoc 3.12.1). The re-capture also picks up
the fig-alt docx filter backport (bd-ykjwiqcc) that main had not
re-captured; the orphaned share tree is removed.

Co-Authored-By: Claude Opus 5.5 <noreply@anthropic.com>
</commit_message>
<xml_diff>
--- a/crates/quarto-core/tests/fixtures/pandoc-recordings/recordings/callouts-docx/capture/callouts.docx
+++ b/crates/quarto-core/tests/fixtures/pandoc-recordings/recordings/callouts-docx/capture/callouts.docx
@@ -66,7 +66,7 @@
                     <a:graphicData uri="http://schemas.openxmlformats.org/drawingml/2006/picture">
                       <pic:pic>
                         <pic:nvPicPr>
-                          <pic:cNvPr descr="/var/folders/f6/n_sr6w3n5_73qcqr433715t00000gn/T/quarto-pipeline_78l9U8/pandoc-share/formats/docx/warning.png" id="12" name="Picture"/>
+                          <pic:cNvPr descr="/var/folders/f6/n_sr6w3n5_73qcqr433715t00000gn/T/quarto-pipeline_1TJ88M/pandoc-share/formats/docx/warning.png" id="12" name="Picture"/>
                           <pic:cNvPicPr>
                             <a:picLocks noChangeArrowheads="1" noChangeAspect="1"/>
                           </pic:cNvPicPr>
@@ -190,7 +190,7 @@
                     <a:graphicData uri="http://schemas.openxmlformats.org/drawingml/2006/picture">
                       <pic:pic>
                         <pic:nvPicPr>
-                          <pic:cNvPr descr="/var/folders/f6/n_sr6w3n5_73qcqr433715t00000gn/T/quarto-pipeline_78l9U8/pandoc-share/formats/docx/important.png" id="15" name="Picture"/>
+                          <pic:cNvPr descr="/var/folders/f6/n_sr6w3n5_73qcqr433715t00000gn/T/quarto-pipeline_1TJ88M/pandoc-share/formats/docx/important.png" id="15" name="Picture"/>
                           <pic:cNvPicPr>
                             <a:picLocks noChangeArrowheads="1" noChangeAspect="1"/>
                           </pic:cNvPicPr>
@@ -314,7 +314,7 @@
                     <a:graphicData uri="http://schemas.openxmlformats.org/drawingml/2006/picture">
                       <pic:pic>
                         <pic:nvPicPr>
-                          <pic:cNvPr descr="/var/folders/f6/n_sr6w3n5_73qcqr433715t00000gn/T/quarto-pipeline_78l9U8/pandoc-share/formats/docx/note.png" id="18" name="Picture"/>
+                          <pic:cNvPr descr="/var/folders/f6/n_sr6w3n5_73qcqr433715t00000gn/T/quarto-pipeline_1TJ88M/pandoc-share/formats/docx/note.png" id="18" name="Picture"/>
                           <pic:cNvPicPr>
                             <a:picLocks noChangeArrowheads="1" noChangeAspect="1"/>
                           </pic:cNvPicPr>
@@ -498,7 +498,7 @@
                     <a:graphicData uri="http://schemas.openxmlformats.org/drawingml/2006/picture">
                       <pic:pic>
                         <pic:nvPicPr>
-                          <pic:cNvPr descr="/var/folders/f6/n_sr6w3n5_73qcqr433715t00000gn/T/quarto-pipeline_78l9U8/pandoc-share/formats/docx/tip.png" id="21" name="Picture"/>
+                          <pic:cNvPr descr="/var/folders/f6/n_sr6w3n5_73qcqr433715t00000gn/T/quarto-pipeline_1TJ88M/pandoc-share/formats/docx/tip.png" id="21" name="Picture"/>
                           <pic:cNvPicPr>
                             <a:picLocks noChangeArrowheads="1" noChangeAspect="1"/>
                           </pic:cNvPicPr>
@@ -624,7 +624,7 @@
                     <a:graphicData uri="http://schemas.openxmlformats.org/drawingml/2006/picture">
                       <pic:pic>
                         <pic:nvPicPr>
-                          <pic:cNvPr descr="/var/folders/f6/n_sr6w3n5_73qcqr433715t00000gn/T/quarto-pipeline_78l9U8/pandoc-share/formats/docx/tip.png" id="24" name="Picture"/>
+                          <pic:cNvPr descr="/var/folders/f6/n_sr6w3n5_73qcqr433715t00000gn/T/quarto-pipeline_1TJ88M/pandoc-share/formats/docx/tip.png" id="24" name="Picture"/>
                           <pic:cNvPicPr>
                             <a:picLocks noChangeArrowheads="1" noChangeAspect="1"/>
                           </pic:cNvPicPr>
@@ -773,7 +773,7 @@
                     <a:graphicData uri="http://schemas.openxmlformats.org/drawingml/2006/picture">
                       <pic:pic>
                         <pic:nvPicPr>
-                          <pic:cNvPr descr="/var/folders/f6/n_sr6w3n5_73qcqr433715t00000gn/T/quarto-pipeline_78l9U8/pandoc-share/formats/docx/caution.png" id="27" name="Picture"/>
+                          <pic:cNvPr descr="/var/folders/f6/n_sr6w3n5_73qcqr433715t00000gn/T/quarto-pipeline_1TJ88M/pandoc-share/formats/docx/caution.png" id="27" name="Picture"/>
                           <pic:cNvPicPr>
                             <a:picLocks noChangeArrowheads="1" noChangeAspect="1"/>
                           </pic:cNvPicPr>
@@ -1018,7 +1018,7 @@
                     <a:graphicData uri="http://schemas.openxmlformats.org/drawingml/2006/picture">
                       <pic:pic>
                         <pic:nvPicPr>
-                          <pic:cNvPr descr="/var/folders/f6/n_sr6w3n5_73qcqr433715t00000gn/T/quarto-pipeline_78l9U8/pandoc-share/formats/docx/caution.png" id="30" name="Picture"/>
+                          <pic:cNvPr descr="/var/folders/f6/n_sr6w3n5_73qcqr433715t00000gn/T/quarto-pipeline_1TJ88M/pandoc-share/formats/docx/caution.png" id="30" name="Picture"/>
                           <pic:cNvPicPr>
                             <a:picLocks noChangeArrowheads="1" noChangeAspect="1"/>
                           </pic:cNvPicPr>
@@ -1129,7 +1129,7 @@
                     <a:graphicData uri="http://schemas.openxmlformats.org/drawingml/2006/picture">
                       <pic:pic>
                         <pic:nvPicPr>
-                          <pic:cNvPr descr="/var/folders/f6/n_sr6w3n5_73qcqr433715t00000gn/T/quarto-pipeline_78l9U8/pandoc-share/formats/docx/caution.png" id="32" name="Picture"/>
+                          <pic:cNvPr descr="/var/folders/f6/n_sr6w3n5_73qcqr433715t00000gn/T/quarto-pipeline_1TJ88M/pandoc-share/formats/docx/caution.png" id="32" name="Picture"/>
                           <pic:cNvPicPr>
                             <a:picLocks noChangeArrowheads="1" noChangeAspect="1"/>
                           </pic:cNvPicPr>

</xml_diff>